<commit_message>
Publication MonGreffier 1.2.16 depuis evidencai-skills ccc46e2
</commit_message>
<xml_diff>
--- a/plugins/mongreffier/skills/mg/assets/template-jugement.docx
+++ b/plugins/mongreffier/skills/mg/assets/template-jugement.docx
@@ -230,18 +230,6 @@
     </w:p>
     <w:p>
       <w:pPr>
-        <w:spacing w:after="60"/>
-      </w:pPr>
-      <w:r>
-        <w:rPr>
-          <w:b/>
-          <w:bCs/>
-        </w:rPr>
-        <w:t>Le tribunal retient :</w:t>
-      </w:r>
-    </w:p>
-    <w:p>
-      <w:pPr>
         <w:spacing w:before="240" w:after="240"/>
         <w:jc w:val="center"/>
       </w:pPr>
@@ -261,7 +249,7 @@
         <w:jc w:val="both"/>
       </w:pPr>
       <w:r>
-        <w:t>Le [juridiction de la fiche du dossier], après en avoir délibéré conformément à la loi, statuant par jugement contradictoire et en premier ressort, prononcé publiquement par mise à disposition au greffe, les parties ayant été préalablement avisées dans les conditions prévues au deuxième alinéa de l'article 450 du Code de procédure civile ;</w:t>
+        <w:t>Le [juridiction de la fiche du dossier], après en avoir délibéré conformément à la loi, statuant par jugement [contradictoire / réputé contradictoire / par défaut] et en [premier / dernier] ressort, prononcé publiquement par mise à disposition au greffe, les parties ayant été préalablement avisées dans les conditions prévues au deuxième alinéa de l'article 450 du Code de procédure civile ;</w:t>
       </w:r>
     </w:p>
     <w:p>
@@ -327,21 +315,6 @@
           <w:bCs/>
         </w:rPr>
         <w:t xml:space="preserve">CONDAMNE </w:t>
-      </w:r>
-    </w:p>
-    <w:p>
-      <w:pPr>
-        <w:jc w:val="both"/>
-      </w:pPr>
-      <w:r>
-        <w:rPr>
-          <w:b/>
-          <w:bCs/>
-        </w:rPr>
-        <w:t>REJETTE</w:t>
-      </w:r>
-      <w:r>
-        <w:t xml:space="preserve"> toutes autres demandes et prétentions</w:t>
       </w:r>
     </w:p>
     <w:p/>
@@ -509,6 +482,9 @@
     <w:pPr>
       <w:jc w:val="center"/>
     </w:pPr>
+    <w:r>
+      <w:t>RG n° [RG] - [DEMANDERESSE] c/ [DÉFENDERESSE]</w:t>
+    </w:r>
   </w:p>
 </w:hdr>
 </file>

</xml_diff>